<commit_message>
Pre-submission review fixes: resolve nested-CV framing contradictions, renumber figures, tighten title
- Rewrite six leftover in-sample-tuning descriptions (long Abstract, Study
  Overview, Methods §2/§3, Recommendations) to the nested-cross-validation
  framing (out-of-fold operating-point selection; training-fold weight
  learning), removing the internal contradiction with the reframed results.
- Renumber main figures 6-14 -> 5-13 so the sequence is gapless after moving
  the abstention figure to Supplementary S8 (captions, inline and panel-letter
  references); file stems retained as provenance (docx embeds all figures).
- Tighten the title to foreground champion-challenger routing.

Co-Authored-By: Claude Opus 4.8 <noreply@anthropic.com>
</commit_message>
<xml_diff>
--- a/docs/CHAMPHLA_MANUSCRIPT_V3.docx
+++ b/docs/CHAMPHLA_MANUSCRIPT_V3.docx
@@ -23,7 +23,7 @@
         <w:rPr>
           <w:b/>
         </w:rPr>
-        <w:t>ChampHLA: A reproducible Nextflow ensemble framework for HLA typing with Champion-Challenger consensus and benchmark-governed confidence weighting across WGS, WES, and RNA sequencing</w:t>
+        <w:t>ChampHLA: a reproducible Nextflow ensemble for champion–challenger HLA typing across WGS, WES, and RNA sequencing</w:t>
       </w:r>
     </w:p>
     <w:p>
@@ -126,7 +126,7 @@
         <w:t>Champion-Challenger</w:t>
       </w:r>
       <w:r>
-        <w:t xml:space="preserve"> ensemble consensus method. ChampHLA eliminates per-tool installation burden, routes each tool to the appropriate input format automatically, and resolves cross-tool disagreement through a principled override policy: each HLA gene is assigned a benchmark-designated champion, and the ensemble may override the champion's call only when the aggregate evidence meets simultaneous criteria for support breadth, weight margin, tool diversity, and allele unambiguity. The override policy is optimised by sweeping a parameter grid over a benchmark cohort and selecting the point that maximises the overall correct-call rate, producing a fully auditable decision trace for every called locus.</w:t>
+        <w:t xml:space="preserve"> ensemble consensus method. ChampHLA eliminates per-tool installation burden, routes each tool to the appropriate input format automatically, and resolves cross-tool disagreement through a principled override policy: each HLA gene is assigned a benchmark-designated champion, and the ensemble may override the champion's call only when the aggregate evidence meets simultaneous criteria for support breadth, weight margin, tool diversity, and allele unambiguity. The champions and override thresholds are selected under nested cross-validation—learned on training folds and evaluated strictly out of fold—so that no reported accuracy is inflated by tuning on the data it is measured against, and every called locus carries a fully auditable decision trace.</w:t>
       </w:r>
     </w:p>
     <w:p>
@@ -376,7 +376,7 @@
     </w:p>
     <w:p>
       <w:r>
-        <w:t>Here we describe ChampHLA version 2.0.0, a reproducible Nextflow ensemble pipeline for HLA typing that integrates eight tools across WGS, WES, RNA-seq, and long-read sequencing. ChampHLA makes three distinct methodological contributions beyond tool integration. First, an empirical calibration guardrail system evaluates each tool's confidence signal against a benchmark truth set and blocks miscalibrated confidence from inflating consensus weights; only tools whose confidence proxies correlate reliably with call correctness (Brier score and expected calibration error both below 0.35) receive a confidence-based weight boost, while miscalibrated tools fall back to base-reliability weighting. Second, the Champion-Challenger ensemble method designates a per-gene benchmark champion and applies a parameterised, sweep-optimised override policy that only replaces the champion's call when the weighted ensemble evidence for an alternative is simultaneously sufficient in breadth, magnitude, tool diversity, and allele unambiguity. Third, to support benchmarking on cohorts that lack gold-standard typing, ChampHLA generates an orthogonal, agreement-gated silver-standard truth from two pangenome- and assembly-based callers (Locityper and Immuannot) that are held separate from the eight-tool consensus panel. The result is a framework in which practitioners can obtain reliable, auditable HLA consensus calls from a single command across any supported sequencing modality, using only Nextflow and a container runtime, with every decision traceable from raw input through harmonised calls to final consensus output.</w:t>
+        <w:t>Here we describe ChampHLA version 2.0.0, a reproducible Nextflow ensemble pipeline for HLA typing that integrates eight tools across WGS, WES, RNA-seq, and long-read sequencing. ChampHLA makes three distinct methodological contributions beyond tool integration. First, an empirical calibration guardrail system evaluates each tool's confidence signal against a benchmark truth set and blocks miscalibrated confidence from inflating consensus weights; only tools whose confidence proxies correlate reliably with call correctness (Brier score and expected calibration error both below 0.35) receive a confidence-based weight boost, while miscalibrated tools fall back to base-reliability weighting. Second, the Champion-Challenger ensemble method designates a per-gene benchmark champion and applies a parameterised, nested-cross-validated override policy (thresholds selected on training folds and applied out of fold) that only replaces the champion's call when the weighted ensemble evidence for an alternative is simultaneously sufficient in breadth, magnitude, tool diversity, and allele unambiguity. Third, to support benchmarking on cohorts that lack gold-standard typing, ChampHLA generates an orthogonal, agreement-gated silver-standard truth from two pangenome- and assembly-based callers (Locityper and Immuannot) that are held separate from the eight-tool consensus panel. The result is a framework in which practitioners can obtain reliable, auditable HLA consensus calls from a single command across any supported sequencing modality, using only Nextflow and a container runtime, with every decision traceable from raw input through harmonised calls to final consensus output.</w:t>
       </w:r>
     </w:p>
     <w:p>
@@ -877,7 +877,7 @@
         <w:rPr>
           <w:b/>
         </w:rPr>
-        <w:t>Figure 8</w:t>
+        <w:t>Figure 7</w:t>
       </w:r>
       <w:r>
         <w:t>.</w:t>
@@ -908,10 +908,10 @@
         <w:rPr>
           <w:b/>
         </w:rPr>
-        <w:t>Figure 11</w:t>
-      </w:r>
-      <w:r>
-        <w:t xml:space="preserve"> contrasts the routed, evidence-gated Champion-Challenger decision flow with the symmetric majority-voting baseline and summarises its effect on the WES truth-backed benchmark.</w:t>
+        <w:t>Figure 10</w:t>
+      </w:r>
+      <w:r>
+        <w:t xml:space="preserve"> contrasts the routed, evidence-gated Champion-Challenger decision flow with the symmetric majority-voting baseline and summarises its effect across the three modality benchmarks under nested cross-validation.</w:t>
       </w:r>
     </w:p>
     <w:p>
@@ -925,7 +925,7 @@
         <w:t>champion</w:t>
       </w:r>
       <w:r>
-        <w:t xml:space="preserve"> based on benchmarking evidence—specifically, the tool with the highest overall correct-call rate for that gene and modality on the training split of the primary benchmark. The champion's call is the default output. The ensemble may produce a </w:t>
+        <w:t xml:space="preserve"> based on benchmarking evidence—specifically, the tool with the highest overall correct-call rate for that gene and modality on the training folds under nested cross-validation. The champion's call is the default output. The ensemble may produce a </w:t>
       </w:r>
       <w:r>
         <w:rPr>
@@ -1166,7 +1166,7 @@
         <w:t>base reliability</w:t>
       </w:r>
       <w:r>
-        <w:t xml:space="preserve"> weight is computed as the fraction of calls matching the ground-truth allele pair at two-field resolution on the training split of the primary WGS benchmark (or the full cohort for WES and RNA-seq secondary benchmarks). Tools with high base reliability receive proportionally higher influence on the weighted consensus vote.</w:t>
+        <w:t xml:space="preserve"> weight is computed as the fraction of calls matching the ground-truth allele pair at two-field resolution on the training folds of the nested cross-validation, so that weights applied to a held-out fold are never learned from it. Tools with high base reliability receive proportionally higher influence on the weighted consensus vote.</w:t>
       </w:r>
     </w:p>
     <w:p>
@@ -2266,7 +2266,7 @@
         <w:t>Supplementary Figure S8</w:t>
       </w:r>
       <w:r>
-        <w:t xml:space="preserve"> (formerly Figure 5).</w:t>
+        <w:t>.</w:t>
       </w:r>
     </w:p>
     <w:p>
@@ -5571,7 +5571,7 @@
         <w:rPr>
           <w:b/>
         </w:rPr>
-        <w:t>Figure 8</w:t>
+        <w:t>Figure 7</w:t>
       </w:r>
       <w:r>
         <w:t>; measured from n=30 1000G samples per modality via Nextflow execution trace, see Methods §7; RNA-seq tool-level n varies from 26 to 30 due to individual tool failures). All values are medians; error whiskers show the P25–P75 interquartile range.</w:t>
@@ -5780,7 +5780,7 @@
         <w:rPr>
           <w:b/>
         </w:rPr>
-        <w:t>Figure 8</w:t>
+        <w:t>Figure 7</w:t>
       </w:r>
       <w:r>
         <w:t>.</w:t>
@@ -5791,7 +5791,7 @@
         <w:rPr>
           <w:b/>
         </w:rPr>
-        <w:t>Figure 8.</w:t>
+        <w:t>Figure 7.</w:t>
       </w:r>
       <w:r>
         <w:t xml:space="preserve"> </w:t>
@@ -5897,7 +5897,7 @@
         <w:rPr>
           <w:b/>
         </w:rPr>
-        <w:t>Figure 6</w:t>
+        <w:t>Figure 5</w:t>
       </w:r>
       <w:r>
         <w:t xml:space="preserve">; </w:t>
@@ -5995,7 +5995,7 @@
         <w:rPr>
           <w:b/>
         </w:rPr>
-        <w:t>Figure 6.</w:t>
+        <w:t>Figure 5.</w:t>
       </w:r>
       <w:r>
         <w:t xml:space="preserve"> </w:t>
@@ -6470,7 +6470,7 @@
         <w:rPr>
           <w:b/>
         </w:rPr>
-        <w:t>Figure 7</w:t>
+        <w:t>Figure 6</w:t>
       </w:r>
       <w:r>
         <w:t>).</w:t>
@@ -7648,16 +7648,7 @@
         <w:rPr>
           <w:b/>
         </w:rPr>
-        <w:t>Supplementary Figure S8</w:t>
-      </w:r>
-      <w:r>
-        <w:t xml:space="preserve"> (formerly Figure 5)</w:t>
-      </w:r>
-      <w:r>
-        <w:rPr>
-          <w:b/>
-        </w:rPr>
-        <w:t>.</w:t>
+        <w:t>Supplementary Figure S8.</w:t>
       </w:r>
       <w:r>
         <w:t xml:space="preserve"> </w:t>
@@ -7683,7 +7674,7 @@
         <w:rPr>
           <w:b/>
         </w:rPr>
-        <w:t>Figure 7.</w:t>
+        <w:t>Figure 6.</w:t>
       </w:r>
       <w:r>
         <w:t xml:space="preserve"> </w:t>
@@ -8867,7 +8858,7 @@
         <w:rPr>
           <w:b/>
         </w:rPr>
-        <w:t>Figure 12A</w:t>
+        <w:t>Figure 11A</w:t>
       </w:r>
       <w:r>
         <w:t>). The strong agreement at G-group resolution—where the 1000 Genomes gold panel itself carries no annotations—confirms that the silver-truth pipeline recovers clinically meaningful allele groups rather than merely two-field strings.</w:t>
@@ -8895,7 +8886,7 @@
         <w:rPr>
           <w:b/>
         </w:rPr>
-        <w:t>Figure 12B</w:t>
+        <w:t>Figure 11B</w:t>
       </w:r>
       <w:r>
         <w:t xml:space="preserve">), with a direct bearing on the silver-truth design. Under the HPRC database, Locityper genotype quality tracked correctness—concordance rose monotonically from 0.811 over all calls to 0.905 for the highest-confidence subset (genotype quality ≥ 20)—whereas under the IMGT-allele database, quality was uninformative or anti-correlated (0.461 over all calls versus 0.432 for genotype quality ≥ 10): the genotyper was </w:t>
@@ -9482,7 +9473,7 @@
         <w:rPr>
           <w:b/>
         </w:rPr>
-        <w:t>Figure 12.</w:t>
+        <w:t>Figure 11.</w:t>
       </w:r>
       <w:r>
         <w:t xml:space="preserve"> </w:t>
@@ -9561,7 +9552,7 @@
         <w:rPr>
           <w:b/>
         </w:rPr>
-        <w:t>Figure 9</w:t>
+        <w:t>Figure 8</w:t>
       </w:r>
       <w:r>
         <w:t>), outperforming all unimodal methods. At the per-gene level, bimodal MajorityVote achieved 0.9717 (HLA-A), 0.9623 (HLA-B), and 0.9528 (HLA-C), with near-complete callable coverage at all three loci. These results confirm that WES and RNA-seq are mutually reinforcing modalities for ensemble HLA typing.</w:t>
@@ -9584,7 +9575,7 @@
         <w:rPr>
           <w:b/>
         </w:rPr>
-        <w:t>Figure 10</w:t>
+        <w:t>Figure 9</w:t>
       </w:r>
       <w:r>
         <w:t>), 3.2 percentage points below the bimodal WES+RNA result. Per-gene trimodal accuracy (A=0.9717, B=0.9623, C=0.9434) is largely unchanged from the bimodal result at HLA-A and HLA-B but shows a marginal improvement at HLA-C (+0.9 percentage points) that does not offset the overall dilution. This negative result for WGS addition is itself informative: it demonstrates that short-read WGS HLA typing in its current form adds more noise than signal when combined with an already-strong WES+RNA bimodal ensemble. The most accurate multimodal strategy for HLA typing with current short-read technology is therefore WES+RNA bimodal consensus, with WGS reserved for cases where WES and RNA-seq data are unavailable.</w:t>
@@ -9595,7 +9586,7 @@
         <w:rPr>
           <w:b/>
         </w:rPr>
-        <w:t>Figure 9.</w:t>
+        <w:t>Figure 8.</w:t>
       </w:r>
       <w:r>
         <w:t xml:space="preserve"> </w:t>
@@ -9654,7 +9645,7 @@
         <w:rPr>
           <w:b/>
         </w:rPr>
-        <w:t>Figure 10.</w:t>
+        <w:t>Figure 9.</w:t>
       </w:r>
       <w:r>
         <w:t xml:space="preserve"> </w:t>
@@ -9713,7 +9704,7 @@
         <w:rPr>
           <w:b/>
         </w:rPr>
-        <w:t>Figure 11.</w:t>
+        <w:t>Figure 10.</w:t>
       </w:r>
       <w:r>
         <w:t xml:space="preserve"> </w:t>
@@ -9840,7 +9831,7 @@
     </w:p>
     <w:p>
       <w:r>
-        <w:t>A central question for any benchmark-tuned ensemble is whether it generalises beyond the cohort on which it was calibrated. We therefore applied the frozen 1000G-derived weights and Champion-Challenger policy, without re-learning, to the independent NCI-60 cancer cell-line panel scored against the Adams et al. (2005) sequence-based constitutional genotypes (Figure 13).</w:t>
+        <w:t>A central question for any benchmark-tuned ensemble is whether it generalises beyond the cohort on which it was calibrated. We therefore applied the frozen 1000G-derived weights and Champion-Challenger policy, without re-learning, to the independent NCI-60 cancer cell-line panel scored against the Adams et al. (2005) sequence-based constitutional genotypes (Figure 12).</w:t>
       </w:r>
     </w:p>
     <w:p>
@@ -9940,7 +9931,7 @@
         <w:t>n</w:t>
       </w:r>
       <w:r>
-        <w:t>=18), the deployed policy also generalised, with an instructive caveat. At the operating point ChampHLA actually ships (support fraction 0.35, challenger margin 0.00, ≥1 supporting tool—the WES optimum from the 1000G sweep), ChampHLA reached an overall correct-call rate of 0.842, exactly matching majority voting (0.842; Wilson 95% CI 0.747–0.905) and above its champion OptiType (0.817). Importantly, the override gate remained active out of distribution: it fired seven overrides, of which three were corrective—all at HLA-A, where it correctly resolved apparent-homozygous calls in EKVX, NCI-H522 and TK-10 that OptiType had split—while one was harmful and three were neutral, all at HLA-C and all involving spuriously high-resolution challenger alleles proposed by a single tool. The net effect was parity with majority voting. A sweep of the operating point on the WES cohort (Figure 13C) localised the issue to the supporting-tools floor rather than the support or margin gates: holding support=0.35 and margin=0.00 and raising the floor from one to two supporting tools eliminates every harmful and neutral override (the spurious single-tool HLA-C calls) while retaining all three corrective HLA-A overrides, lifting ChampHLA to 0.854 and overtaking majority voting; requiring three supporting tools is over-strict and suppresses all overrides (reverting to OptiType, 0.817).</w:t>
+        <w:t>=18), the deployed policy also generalised, with an instructive caveat. At the operating point ChampHLA actually ships (support fraction 0.35, challenger margin 0.00, ≥1 supporting tool—the WES optimum from the 1000G sweep), ChampHLA reached an overall correct-call rate of 0.842, exactly matching majority voting (0.842; Wilson 95% CI 0.747–0.905) and above its champion OptiType (0.817). Importantly, the override gate remained active out of distribution: it fired seven overrides, of which three were corrective—all at HLA-A, where it correctly resolved apparent-homozygous calls in EKVX, NCI-H522 and TK-10 that OptiType had split—while one was harmful and three were neutral, all at HLA-C and all involving spuriously high-resolution challenger alleles proposed by a single tool. The net effect was parity with majority voting. A sweep of the operating point on the WES cohort (Figure 12C) localised the issue to the supporting-tools floor rather than the support or margin gates: holding support=0.35 and margin=0.00 and raising the floor from one to two supporting tools eliminates every harmful and neutral override (the spurious single-tool HLA-C calls) while retaining all three corrective HLA-A overrides, lifting ChampHLA to 0.854 and overtaking majority voting; requiring three supporting tools is over-strict and suppresses all overrides (reverting to OptiType, 0.817).</w:t>
       </w:r>
     </w:p>
     <w:p>
@@ -10727,7 +10718,7 @@
         <w:rPr>
           <w:b/>
         </w:rPr>
-        <w:t>Figure 13.</w:t>
+        <w:t>Figure 12.</w:t>
       </w:r>
       <w:r>
         <w:t xml:space="preserve"> </w:t>
@@ -10865,7 +10856,7 @@
         <w:rPr>
           <w:b/>
         </w:rPr>
-        <w:t>Figure 14A</w:t>
+        <w:t>Figure 13A</w:t>
       </w:r>
       <w:r>
         <w:t xml:space="preserve">). Concordance held across A2 subtypes, including a donor typed </w:t>
@@ -10901,7 +10892,7 @@
         <w:rPr>
           <w:b/>
         </w:rPr>
-        <w:t>Figure 14B</w:t>
+        <w:t>Figure 13B</w:t>
       </w:r>
       <w:r>
         <w:t xml:space="preserve">). Extending the definition to the cross-reactive </w:t>
@@ -11638,7 +11629,7 @@
         <w:rPr>
           <w:b/>
         </w:rPr>
-        <w:t>Figure 14.</w:t>
+        <w:t>Figure 13.</w:t>
       </w:r>
       <w:r>
         <w:t xml:space="preserve"> </w:t>
@@ -11894,7 +11885,7 @@
         <w:rPr>
           <w:b/>
         </w:rPr>
-        <w:t>Figure 8</w:t>
+        <w:t>Figure 7</w:t>
       </w:r>
       <w:r>
         <w:t xml:space="preserve"> for per-tool resource profiles.</w:t>
@@ -11982,7 +11973,7 @@
         <w:rPr>
           <w:b/>
         </w:rPr>
-        <w:t>Figure 8</w:t>
+        <w:t>Figure 7</w:t>
       </w:r>
       <w:r>
         <w:t xml:space="preserve"> (Results §2) for per-tool resource profiles.</w:t>
@@ -12092,7 +12083,7 @@
     </w:p>
     <w:p>
       <w:r>
-        <w:t xml:space="preserve">For clinical or research settings where reliable allele calls are required and false positives (harmful Champion-Challenger overrides) are particularly consequential, we recommend using a more conservative override policy by increasing the </w:t>
+        <w:t xml:space="preserve">For clinical or research settings where reliable allele calls are required and false positives (harmful Champion-Challenger overrides) are particularly consequential, we recommend a more conservative override policy—raising </w:t>
       </w:r>
       <w:r>
         <w:rPr>
@@ -12101,7 +12092,25 @@
         <w:t>min_challenger_support_fraction</w:t>
       </w:r>
       <w:r>
-        <w:t xml:space="preserve"> threshold above the default 0.35 sweep optimum. This trades some corrective-override recall for increased precision:</w:t>
+        <w:t xml:space="preserve"> and </w:t>
+      </w:r>
+      <w:r>
+        <w:rPr>
+          <w:rFonts w:ascii="Consolas" w:hAnsi="Consolas"/>
+        </w:rPr>
+        <w:t>min_challenger_margin</w:t>
+      </w:r>
+      <w:r>
+        <w:t xml:space="preserve"> above the nested-CV-selected default and requiring at least two supporting tools. The full in-sample sweep surface (</w:t>
+      </w:r>
+      <w:r>
+        <w:rPr>
+          <w:rFonts w:ascii="Consolas" w:hAnsi="Consolas"/>
+        </w:rPr>
+        <w:t>wes_champion_override_sweep.tsv</w:t>
+      </w:r>
+      <w:r>
+        <w:t>) is provided as a tuning aid for choosing an institution-specific operating point (it is a tuning aid, not a performance estimate). This trades some corrective-override recall for increased precision:</w:t>
       </w:r>
     </w:p>
     <w:p>
@@ -12470,7 +12479,7 @@
         <w:t>Supplementary Figure S8</w:t>
       </w:r>
       <w:r>
-        <w:t xml:space="preserve"> (the former main-text Figure 5) shows the abstention–accuracy tradeoff for the weighting-only WeightedConsensus across modalities: as the support threshold rises, callable rate falls and accuracy among called loci rises. This is a secondary reliability property (a "defer rather than err" option) of the weighting scheme and is not part of the primary Champion-Challenger accuracy comparison; the overall correct-call rate of WeightedConsensus remains below majority voting in every modality (Table 3, ablation row).</w:t>
+        <w:t xml:space="preserve"> shows the abstention–accuracy tradeoff for the weighting-only WeightedConsensus across modalities: as the support threshold rises, callable rate falls and accuracy among called loci rises. This is a secondary reliability property (a "defer rather than err" option) of the weighting scheme and is not part of the primary Champion-Challenger accuracy comparison; the overall correct-call rate of WeightedConsensus remains below majority voting in every modality (Table 3, ablation row).</w:t>
       </w:r>
     </w:p>
     <w:p>

</xml_diff>

<commit_message>
Clean, contiguous supplementary numbering (per-series from S1)
Renumbered supplementary items so each series is numbered independently from S1,
fixing the overloaded/gapped namespace left by the main-figure consolidation:

- Supplementary Figures: S1-S8 unchanged; S12-S17 -> S9-S14 (now S1-S14 contiguous;
  panel refs S16A/B -> S13A/B, S17C -> S14C).
- Supplementary Tables: S9-S11 -> S1-S3.
- Supplementary Notes: unchanged (S1-S8, sub-sections S3.x / S7.x intact).

Applied consistently across the main manuscript and the separate supplementary
document; the range/summary sentences (supp intro, main "Supplementary Materials"
pointer) were rewritten to the new contiguous ranges (also correcting a stale
"Notes S1-S11"). Figure source stems unchanged. Both docx rebuilt: main 7 figures,
supplementary 14; all 12 main-text supplementary references resolve to a caption.

Co-Authored-By: Claude Opus 4.8 <noreply@anthropic.com>
</commit_message>
<xml_diff>
--- a/docs/CHAMPHLA_MANUSCRIPT_V3.docx
+++ b/docs/CHAMPHLA_MANUSCRIPT_V3.docx
@@ -877,7 +877,7 @@
         <w:rPr>
           <w:b/>
         </w:rPr>
-        <w:t>Supplementary Figure S14</w:t>
+        <w:t>Supplementary Figure S11</w:t>
       </w:r>
       <w:r>
         <w:t>.</w:t>
@@ -5598,7 +5598,7 @@
         <w:rPr>
           <w:b/>
         </w:rPr>
-        <w:t>Supplementary Figure S14</w:t>
+        <w:t>Supplementary Figure S11</w:t>
       </w:r>
       <w:r>
         <w:t>; measured from n=30 1000G samples per modality via Nextflow execution trace, see Methods §7; RNA-seq tool-level n varies from 26 to 30 due to individual tool failures). All values are medians; error whiskers show the P25–P75 interquartile range.</w:t>
@@ -5807,7 +5807,7 @@
         <w:rPr>
           <w:b/>
         </w:rPr>
-        <w:t>Supplementary Figure S14</w:t>
+        <w:t>Supplementary Figure S11</w:t>
       </w:r>
       <w:r>
         <w:t>.</w:t>
@@ -5838,7 +5838,7 @@
         <w:rPr>
           <w:b/>
         </w:rPr>
-        <w:t>Supplementary Figure S12</w:t>
+        <w:t>Supplementary Figure S9</w:t>
       </w:r>
       <w:r>
         <w:t xml:space="preserve">; </w:t>
@@ -6307,7 +6307,7 @@
         <w:rPr>
           <w:b/>
         </w:rPr>
-        <w:t>Supplementary Figure S13</w:t>
+        <w:t>Supplementary Figure S10</w:t>
       </w:r>
       <w:r>
         <w:t>).</w:t>
@@ -8576,7 +8576,7 @@
         <w:rPr>
           <w:b/>
         </w:rPr>
-        <w:t>Supplementary Table S9</w:t>
+        <w:t>Supplementary Table S1</w:t>
       </w:r>
       <w:r>
         <w:t xml:space="preserve"> (commonness) and </w:t>
@@ -8585,7 +8585,7 @@
         <w:rPr>
           <w:b/>
         </w:rPr>
-        <w:t>Supplementary Table S10</w:t>
+        <w:t>Supplementary Table S2</w:t>
       </w:r>
       <w:r>
         <w:t xml:space="preserve"> (ancestry) (</w:t>
@@ -8658,7 +8658,7 @@
         <w:rPr>
           <w:b/>
         </w:rPr>
-        <w:t>Supplementary Figure S16A</w:t>
+        <w:t>Supplementary Figure S13A</w:t>
       </w:r>
       <w:r>
         <w:t>). The strong agreement at G-group resolution—where the 1000 Genomes gold panel itself carries no annotations—confirms that the silver-truth pipeline recovers clinically meaningful allele groups rather than merely two-field strings.</w:t>
@@ -8686,7 +8686,7 @@
         <w:rPr>
           <w:b/>
         </w:rPr>
-        <w:t>Supplementary Figure S16B</w:t>
+        <w:t>Supplementary Figure S13B</w:t>
       </w:r>
       <w:r>
         <w:t xml:space="preserve">), with a direct bearing on the silver-truth design. Under the HPRC database, Locityper genotype quality tracked correctness—concordance rose monotonically from 0.811 over all calls to 0.905 for the highest-confidence subset (genotype quality ≥ 20)—whereas under the IMGT-allele database, quality was uninformative or anti-correlated (0.461 over all calls versus 0.432 for genotype quality ≥ 10): the genotyper was </w:t>
@@ -9316,7 +9316,7 @@
         <w:rPr>
           <w:b/>
         </w:rPr>
-        <w:t>Supplementary Figure S15</w:t>
+        <w:t>Supplementary Figure S12</w:t>
       </w:r>
       <w:r>
         <w:t>), 3.2 percentage points below the bimodal WES+RNA result. Per-gene trimodal accuracy (A=0.9717, B=0.9623, C=0.9434) is largely unchanged from the bimodal result at HLA-A and HLA-B but shows a marginal improvement at HLA-C (+0.9 percentage points) that does not offset the overall dilution. This negative result for WGS addition is itself informative: it demonstrates that short-read WGS HLA typing in its current form adds more noise than signal when combined with an already-strong WES+RNA bimodal ensemble. The most accurate multimodal strategy for HLA typing with current short-read technology is therefore WES+RNA bimodal consensus, with WGS reserved for cases where WES and RNA-seq data are unavailable.</w:t>
@@ -9513,7 +9513,7 @@
     </w:p>
     <w:p>
       <w:r>
-        <w:t>A central question for any benchmark-tuned ensemble is whether it generalises beyond the cohort on which it was calibrated. We therefore applied the frozen 1000G-derived weights and Champion-Challenger policy, without re-learning, to the independent NCI-60 cancer cell-line panel scored against the Adams et al. (2005) sequence-based constitutional genotypes (Supplementary Figure S17).</w:t>
+        <w:t>A central question for any benchmark-tuned ensemble is whether it generalises beyond the cohort on which it was calibrated. We therefore applied the frozen 1000G-derived weights and Champion-Challenger policy, without re-learning, to the independent NCI-60 cancer cell-line panel scored against the Adams et al. (2005) sequence-based constitutional genotypes (Supplementary Figure S14).</w:t>
       </w:r>
     </w:p>
     <w:p>
@@ -9613,7 +9613,7 @@
         <w:t>n</w:t>
       </w:r>
       <w:r>
-        <w:t>=18), the deployed policy also generalised, with an instructive caveat. At the operating point ChampHLA actually ships (support fraction 0.35, challenger margin 0.00, ≥1 supporting tool—the WES optimum from the 1000G sweep), ChampHLA reached an overall correct-call rate of 0.842, exactly matching majority voting (0.842; Wilson 95% CI 0.747–0.905) and above its champion OptiType (0.817). Importantly, the override gate remained active out of distribution: it fired seven overrides, of which three were corrective—all at HLA-A, where it correctly resolved apparent-homozygous calls in EKVX, NCI-H522 and TK-10 that OptiType had split—while one was harmful and three were neutral, all at HLA-C and all involving spuriously high-resolution challenger alleles proposed by a single tool. The net effect was parity with majority voting. A sweep of the operating point on the WES cohort (Supplementary Figure S17C) localised the issue to the supporting-tools floor rather than the support or margin gates: holding support=0.35 and margin=0.00 and raising the floor from one to two supporting tools eliminates every harmful and neutral override (the spurious single-tool HLA-C calls) while retaining all three corrective HLA-A overrides, lifting ChampHLA to 0.854 and overtaking majority voting; requiring three supporting tools is over-strict and suppresses all overrides (reverting to OptiType, 0.817).</w:t>
+        <w:t>=18), the deployed policy also generalised, with an instructive caveat. At the operating point ChampHLA actually ships (support fraction 0.35, challenger margin 0.00, ≥1 supporting tool—the WES optimum from the 1000G sweep), ChampHLA reached an overall correct-call rate of 0.842, exactly matching majority voting (0.842; Wilson 95% CI 0.747–0.905) and above its champion OptiType (0.817). Importantly, the override gate remained active out of distribution: it fired seven overrides, of which three were corrective—all at HLA-A, where it correctly resolved apparent-homozygous calls in EKVX, NCI-H522 and TK-10 that OptiType had split—while one was harmful and three were neutral, all at HLA-C and all involving spuriously high-resolution challenger alleles proposed by a single tool. The net effect was parity with majority voting. A sweep of the operating point on the WES cohort (Supplementary Figure S14C) localised the issue to the supporting-tools floor rather than the support or margin gates: holding support=0.35 and margin=0.00 and raising the floor from one to two supporting tools eliminates every harmful and neutral override (the spurious single-tool HLA-C calls) while retaining all three corrective HLA-A overrides, lifting ChampHLA to 0.854 and overtaking majority voting; requiring three supporting tools is over-strict and suppresses all overrides (reverting to OptiType, 0.817).</w:t>
       </w:r>
     </w:p>
     <w:p>
@@ -11463,7 +11463,7 @@
         <w:rPr>
           <w:b/>
         </w:rPr>
-        <w:t>Supplementary Figure S14</w:t>
+        <w:t>Supplementary Figure S11</w:t>
       </w:r>
       <w:r>
         <w:t xml:space="preserve"> for per-tool resource profiles.</w:t>
@@ -11551,7 +11551,7 @@
         <w:rPr>
           <w:b/>
         </w:rPr>
-        <w:t>Supplementary Figure S14</w:t>
+        <w:t>Supplementary Figure S11</w:t>
       </w:r>
       <w:r>
         <w:t xml:space="preserve"> (Results §2) for per-tool resource profiles.</w:t>
@@ -11899,7 +11899,7 @@
         <w:t>.docx</w:t>
       </w:r>
       <w:r>
-        <w:t xml:space="preserve">): Supplementary Figures S1–S8 and S12–S17, Supplementary Tables S9–S11, and Supplementary Notes S1–S11. Each supplementary figure is embedded there with its source stem under </w:t>
+        <w:t xml:space="preserve">): Supplementary Figures S1–S14, Supplementary Tables S1–S3, and Supplementary Notes S1–S8. Each supplementary figure is embedded there with its source stem under </w:t>
       </w:r>
       <w:r>
         <w:rPr>

</xml_diff>